<commit_message>
Improve schedule generation preview and lecture-lab splitting
</commit_message>
<xml_diff>
--- a/docs/generate-schedule-workflow.docx
+++ b/docs/generate-schedule-workflow.docx
@@ -320,6 +320,156 @@
       </w:r>
       <w:r>
         <w:t>The solver tried on-site and online possibilities, but every option still failed time checks, conflicts, or scheduling rules.</w:t>
+      </w:r>
+    </w:p>
+    <w:p>
+      <w:r>
+        <w:br w:type="page"/>
+      </w:r>
+    </w:p>
+    <w:p>
+      <w:r>
+        <w:br w:type="page"/>
+      </w:r>
+    </w:p>
+    <w:p>
+      <w:pPr>
+        <w:pStyle w:val="Heading1"/>
+        <w:jc w:val="left"/>
+      </w:pPr>
+      <w:r>
+        <w:t>Department Room/Laboratory Workflow</w:t>
+      </w:r>
+    </w:p>
+    <w:p>
+      <w:r>
+        <w:t>This workflow explains how Generate Schedule chooses between a laboratory, a regular room, or online mode for major courses. It is useful because not all departments have their own laboratory.</w:t>
+      </w:r>
+    </w:p>
+    <w:p>
+      <w:pPr>
+        <w:pStyle w:val="Heading2"/>
+      </w:pPr>
+      <w:r>
+        <w:t>Flowchart</w:t>
+      </w:r>
+    </w:p>
+    <w:p>
+      <w:pPr>
+        <w:jc w:val="center"/>
+      </w:pPr>
+      <w:r>
+        <w:drawing>
+          <wp:inline xmlns:a="http://schemas.openxmlformats.org/drawingml/2006/main" xmlns:pic="http://schemas.openxmlformats.org/drawingml/2006/picture">
+            <wp:extent cx="5943600" cy="5230368"/>
+            <wp:docPr id="2" name="Picture 2"/>
+            <wp:cNvGraphicFramePr>
+              <a:graphicFrameLocks noChangeAspect="1"/>
+            </wp:cNvGraphicFramePr>
+            <a:graphic>
+              <a:graphicData uri="http://schemas.openxmlformats.org/drawingml/2006/picture">
+                <pic:pic>
+                  <pic:nvPicPr>
+                    <pic:cNvPr id="0" name="generate-schedule-room-lab-flowchart.png"/>
+                    <pic:cNvPicPr/>
+                  </pic:nvPicPr>
+                  <pic:blipFill>
+                    <a:blip r:embed="rId12"/>
+                    <a:stretch>
+                      <a:fillRect/>
+                    </a:stretch>
+                  </pic:blipFill>
+                  <pic:spPr>
+                    <a:xfrm>
+                      <a:off x="0" y="0"/>
+                      <a:ext cx="5943600" cy="5230368"/>
+                    </a:xfrm>
+                    <a:prstGeom prst="rect"/>
+                  </pic:spPr>
+                </pic:pic>
+              </a:graphicData>
+            </a:graphic>
+          </wp:inline>
+        </w:drawing>
+      </w:r>
+    </w:p>
+    <w:p>
+      <w:pPr>
+        <w:pStyle w:val="Heading2"/>
+      </w:pPr>
+      <w:r>
+        <w:t>Simple Explanation</w:t>
+      </w:r>
+    </w:p>
+    <w:p>
+      <w:pPr>
+        <w:pStyle w:val="ListBullet"/>
+        <w:spacing w:after="80"/>
+      </w:pPr>
+      <w:r>
+        <w:t>If the major course has laboratory hours, the system tries a laboratory room first.</w:t>
+      </w:r>
+    </w:p>
+    <w:p>
+      <w:pPr>
+        <w:pStyle w:val="ListBullet"/>
+        <w:spacing w:after="80"/>
+      </w:pPr>
+      <w:r>
+        <w:t>If no laboratory is available, the system tries a regular room.</w:t>
+      </w:r>
+    </w:p>
+    <w:p>
+      <w:pPr>
+        <w:pStyle w:val="ListBullet"/>
+        <w:spacing w:after="80"/>
+      </w:pPr>
+      <w:r>
+        <w:t>If the major course has no laboratory hours, the system tries a regular room first.</w:t>
+      </w:r>
+    </w:p>
+    <w:p>
+      <w:pPr>
+        <w:pStyle w:val="ListBullet"/>
+        <w:spacing w:after="80"/>
+      </w:pPr>
+      <w:r>
+        <w:t>If no physical room works, the system tries online mode.</w:t>
+      </w:r>
+    </w:p>
+    <w:p>
+      <w:pPr>
+        <w:pStyle w:val="ListBullet"/>
+        <w:spacing w:after="80"/>
+      </w:pPr>
+      <w:r>
+        <w:t>Online mode does not need a room, but it still checks time, faculty, section, and online class limit.</w:t>
+      </w:r>
+    </w:p>
+    <w:p>
+      <w:pPr>
+        <w:pStyle w:val="ListBullet"/>
+        <w:spacing w:after="80"/>
+      </w:pPr>
+      <w:r>
+        <w:t>If every option fails, the system shows: No valid schedule recommendation found.</w:t>
+      </w:r>
+    </w:p>
+    <w:p>
+      <w:pPr>
+        <w:pStyle w:val="Heading2"/>
+      </w:pPr>
+      <w:r>
+        <w:t>Short Rule</w:t>
+      </w:r>
+    </w:p>
+    <w:p>
+      <w:r>
+        <w:rPr>
+          <w:b/>
+          <w:color w:val="1F4E79"/>
+        </w:rPr>
+        <w:t>Use laboratory for lab courses, use regular rooms for non-lab major courses, and use online only when no valid physical schedule works.</w:t>
       </w:r>
     </w:p>
     <w:sectPr>

</xml_diff>